<commit_message>
menambahkan seluruh laporan p03
</commit_message>
<xml_diff>
--- a/laporan/P01 laporan 25430120 · MD.docx
+++ b/laporan/P01 laporan 25430120 · MD.docx
@@ -57,7 +57,6 @@
         </w:rPr>
         <w:t xml:space="preserve"> </w:t>
       </w:r>
-      <w:proofErr w:type="spellStart"/>
       <w:r>
         <w:rPr>
           <w:rFonts w:ascii="Times New Roman" w:hAnsi="Times New Roman" w:cs="Times New Roman"/>
@@ -66,9 +65,9 @@
           <w:sz w:val="28"/>
           <w:szCs w:val="28"/>
         </w:rPr>
-        <w:t>Pertemuan</w:t>
-      </w:r>
-      <w:proofErr w:type="spellEnd"/>
+        <w:t xml:space="preserve">Basis Data </w:t>
+      </w:r>
+      <w:proofErr w:type="spellStart"/>
       <w:r>
         <w:rPr>
           <w:rFonts w:ascii="Times New Roman" w:hAnsi="Times New Roman" w:cs="Times New Roman"/>
@@ -77,12 +76,10 @@
           <w:sz w:val="28"/>
           <w:szCs w:val="28"/>
         </w:rPr>
-        <w:t xml:space="preserve"> 1</w:t>
-      </w:r>
-    </w:p>
-    <w:p>
-      <w:pPr>
-        <w:spacing w:line="360" w:lineRule="auto"/>
+        <w:t>Pertemuan</w:t>
+      </w:r>
+      <w:proofErr w:type="spellEnd"/>
+      <w:r>
         <w:rPr>
           <w:rFonts w:ascii="Times New Roman" w:hAnsi="Times New Roman" w:cs="Times New Roman"/>
           <w:b/>
@@ -90,9 +87,12 @@
           <w:sz w:val="28"/>
           <w:szCs w:val="28"/>
         </w:rPr>
-      </w:pPr>
-      <w:proofErr w:type="spellStart"/>
-      <w:r>
+        <w:t xml:space="preserve"> 1</w:t>
+      </w:r>
+    </w:p>
+    <w:p>
+      <w:pPr>
+        <w:spacing w:line="360" w:lineRule="auto"/>
         <w:rPr>
           <w:rFonts w:ascii="Times New Roman" w:hAnsi="Times New Roman" w:cs="Times New Roman"/>
           <w:b/>
@@ -100,9 +100,8 @@
           <w:sz w:val="28"/>
           <w:szCs w:val="28"/>
         </w:rPr>
-        <w:t>Lingkungan</w:t>
-      </w:r>
-      <w:proofErr w:type="spellEnd"/>
+      </w:pPr>
+      <w:proofErr w:type="spellStart"/>
       <w:r>
         <w:rPr>
           <w:rFonts w:ascii="Times New Roman" w:hAnsi="Times New Roman" w:cs="Times New Roman"/>
@@ -111,9 +110,9 @@
           <w:sz w:val="28"/>
           <w:szCs w:val="28"/>
         </w:rPr>
-        <w:t xml:space="preserve"> </w:t>
-      </w:r>
-      <w:proofErr w:type="spellStart"/>
+        <w:t>Lingkungan</w:t>
+      </w:r>
+      <w:proofErr w:type="spellEnd"/>
       <w:r>
         <w:rPr>
           <w:rFonts w:ascii="Times New Roman" w:hAnsi="Times New Roman" w:cs="Times New Roman"/>
@@ -122,9 +121,9 @@
           <w:sz w:val="28"/>
           <w:szCs w:val="28"/>
         </w:rPr>
-        <w:t>Kerja</w:t>
-      </w:r>
-      <w:proofErr w:type="spellEnd"/>
+        <w:t xml:space="preserve"> </w:t>
+      </w:r>
+      <w:proofErr w:type="spellStart"/>
       <w:r>
         <w:rPr>
           <w:rFonts w:ascii="Times New Roman" w:hAnsi="Times New Roman" w:cs="Times New Roman"/>
@@ -133,12 +132,10 @@
           <w:sz w:val="28"/>
           <w:szCs w:val="28"/>
         </w:rPr>
-        <w:t xml:space="preserve"> MariaDB di XAMPP dan Git</w:t>
-      </w:r>
-    </w:p>
-    <w:p>
-      <w:pPr>
-        <w:spacing w:line="360" w:lineRule="auto"/>
+        <w:t>Kerja</w:t>
+      </w:r>
+      <w:proofErr w:type="spellEnd"/>
+      <w:r>
         <w:rPr>
           <w:rFonts w:ascii="Times New Roman" w:hAnsi="Times New Roman" w:cs="Times New Roman"/>
           <w:b/>
@@ -146,12 +143,12 @@
           <w:sz w:val="28"/>
           <w:szCs w:val="28"/>
         </w:rPr>
-      </w:pPr>
-    </w:p>
-    <w:p>
-      <w:pPr>
-        <w:spacing w:line="360" w:lineRule="auto"/>
-        <w:ind w:left="720" w:hanging="720"/>
+        <w:t xml:space="preserve"> MariaDB di XAMPP dan Git</w:t>
+      </w:r>
+    </w:p>
+    <w:p>
+      <w:pPr>
+        <w:spacing w:line="360" w:lineRule="auto"/>
         <w:rPr>
           <w:rFonts w:ascii="Times New Roman" w:hAnsi="Times New Roman" w:cs="Times New Roman"/>
           <w:b/>
@@ -160,8 +157,11 @@
           <w:szCs w:val="28"/>
         </w:rPr>
       </w:pPr>
-      <w:proofErr w:type="gramStart"/>
-      <w:r>
+    </w:p>
+    <w:p>
+      <w:pPr>
+        <w:spacing w:line="360" w:lineRule="auto"/>
+        <w:ind w:left="720" w:hanging="720"/>
         <w:rPr>
           <w:rFonts w:ascii="Times New Roman" w:hAnsi="Times New Roman" w:cs="Times New Roman"/>
           <w:b/>
@@ -169,9 +169,7 @@
           <w:sz w:val="28"/>
           <w:szCs w:val="28"/>
         </w:rPr>
-        <w:t>Nama :</w:t>
-      </w:r>
-      <w:proofErr w:type="gramEnd"/>
+      </w:pPr>
       <w:r>
         <w:rPr>
           <w:rFonts w:ascii="Times New Roman" w:hAnsi="Times New Roman" w:cs="Times New Roman"/>
@@ -180,13 +178,9 @@
           <w:sz w:val="28"/>
           <w:szCs w:val="28"/>
         </w:rPr>
-        <w:t xml:space="preserve"> ADILLA BALQIS PUTRI ANTONI</w:t>
-      </w:r>
-    </w:p>
-    <w:p>
-      <w:pPr>
-        <w:spacing w:line="360" w:lineRule="auto"/>
-        <w:ind w:left="720" w:hanging="720"/>
+        <w:t xml:space="preserve">Nama </w:t>
+      </w:r>
+      <w:r>
         <w:rPr>
           <w:rFonts w:ascii="Times New Roman" w:hAnsi="Times New Roman" w:cs="Times New Roman"/>
           <w:b/>
@@ -194,8 +188,8 @@
           <w:sz w:val="28"/>
           <w:szCs w:val="28"/>
         </w:rPr>
-      </w:pPr>
-      <w:proofErr w:type="gramStart"/>
+        <w:tab/>
+      </w:r>
       <w:r>
         <w:rPr>
           <w:rFonts w:ascii="Times New Roman" w:hAnsi="Times New Roman" w:cs="Times New Roman"/>
@@ -204,9 +198,8 @@
           <w:sz w:val="28"/>
           <w:szCs w:val="28"/>
         </w:rPr>
-        <w:t>NIM :</w:t>
-      </w:r>
-      <w:proofErr w:type="gramEnd"/>
+        <w:tab/>
+      </w:r>
       <w:r>
         <w:rPr>
           <w:rFonts w:ascii="Times New Roman" w:hAnsi="Times New Roman" w:cs="Times New Roman"/>
@@ -215,7 +208,7 @@
           <w:sz w:val="28"/>
           <w:szCs w:val="28"/>
         </w:rPr>
-        <w:t xml:space="preserve"> 25430120</w:t>
+        <w:t>: ADILLA BALQIS PUTRI ANTONI</w:t>
       </w:r>
     </w:p>
     <w:p>
@@ -230,8 +223,6 @@
           <w:szCs w:val="28"/>
         </w:rPr>
       </w:pPr>
-      <w:proofErr w:type="spellStart"/>
-      <w:proofErr w:type="gramStart"/>
       <w:r>
         <w:rPr>
           <w:rFonts w:ascii="Times New Roman" w:hAnsi="Times New Roman" w:cs="Times New Roman"/>
@@ -240,9 +231,8 @@
           <w:sz w:val="28"/>
           <w:szCs w:val="28"/>
         </w:rPr>
-        <w:t>Kelas</w:t>
-      </w:r>
-      <w:proofErr w:type="spellEnd"/>
+        <w:t>N</w:t>
+      </w:r>
       <w:r>
         <w:rPr>
           <w:rFonts w:ascii="Times New Roman" w:hAnsi="Times New Roman" w:cs="Times New Roman"/>
@@ -251,9 +241,8 @@
           <w:sz w:val="28"/>
           <w:szCs w:val="28"/>
         </w:rPr>
-        <w:t xml:space="preserve"> :</w:t>
-      </w:r>
-      <w:proofErr w:type="gramEnd"/>
+        <w:t>P</w:t>
+      </w:r>
       <w:r>
         <w:rPr>
           <w:rFonts w:ascii="Times New Roman" w:hAnsi="Times New Roman" w:cs="Times New Roman"/>
@@ -262,13 +251,9 @@
           <w:sz w:val="28"/>
           <w:szCs w:val="28"/>
         </w:rPr>
-        <w:t xml:space="preserve"> B</w:t>
-      </w:r>
-    </w:p>
-    <w:p>
-      <w:pPr>
-        <w:spacing w:line="360" w:lineRule="auto"/>
-        <w:ind w:left="720" w:hanging="720"/>
+        <w:t>M</w:t>
+      </w:r>
+      <w:r>
         <w:rPr>
           <w:rFonts w:ascii="Times New Roman" w:hAnsi="Times New Roman" w:cs="Times New Roman"/>
           <w:b/>
@@ -276,7 +261,8 @@
           <w:sz w:val="28"/>
           <w:szCs w:val="28"/>
         </w:rPr>
-      </w:pPr>
+        <w:tab/>
+      </w:r>
       <w:r>
         <w:rPr>
           <w:rFonts w:ascii="Times New Roman" w:hAnsi="Times New Roman" w:cs="Times New Roman"/>
@@ -285,9 +271,8 @@
           <w:sz w:val="28"/>
           <w:szCs w:val="28"/>
         </w:rPr>
-        <w:t xml:space="preserve">Tema </w:t>
-      </w:r>
-      <w:proofErr w:type="spellStart"/>
+        <w:tab/>
+      </w:r>
       <w:proofErr w:type="gramStart"/>
       <w:r>
         <w:rPr>
@@ -297,9 +282,8 @@
           <w:sz w:val="28"/>
           <w:szCs w:val="28"/>
         </w:rPr>
-        <w:t>proyek</w:t>
-      </w:r>
-      <w:proofErr w:type="spellEnd"/>
+        <w:tab/>
+      </w:r>
       <w:r>
         <w:rPr>
           <w:rFonts w:ascii="Times New Roman" w:hAnsi="Times New Roman" w:cs="Times New Roman"/>
@@ -319,10 +303,13 @@
           <w:sz w:val="28"/>
           <w:szCs w:val="28"/>
         </w:rPr>
-        <w:t xml:space="preserve"> </w:t>
-      </w:r>
-      <w:proofErr w:type="spellStart"/>
-      <w:r>
+        <w:t xml:space="preserve"> 25430120</w:t>
+      </w:r>
+    </w:p>
+    <w:p>
+      <w:pPr>
+        <w:spacing w:line="360" w:lineRule="auto"/>
+        <w:ind w:left="720" w:hanging="720"/>
         <w:rPr>
           <w:rFonts w:ascii="Times New Roman" w:hAnsi="Times New Roman" w:cs="Times New Roman"/>
           <w:b/>
@@ -330,9 +317,8 @@
           <w:sz w:val="28"/>
           <w:szCs w:val="28"/>
         </w:rPr>
-        <w:t>Perpustakaan</w:t>
-      </w:r>
-      <w:proofErr w:type="spellEnd"/>
+      </w:pPr>
+      <w:proofErr w:type="spellStart"/>
       <w:r>
         <w:rPr>
           <w:rFonts w:ascii="Times New Roman" w:hAnsi="Times New Roman" w:cs="Times New Roman"/>
@@ -341,7 +327,207 @@
           <w:sz w:val="28"/>
           <w:szCs w:val="28"/>
         </w:rPr>
+        <w:t>Kelas</w:t>
+      </w:r>
+      <w:proofErr w:type="spellEnd"/>
+      <w:r>
+        <w:rPr>
+          <w:rFonts w:ascii="Times New Roman" w:hAnsi="Times New Roman" w:cs="Times New Roman"/>
+          <w:b/>
+          <w:bCs/>
+          <w:sz w:val="28"/>
+          <w:szCs w:val="28"/>
+        </w:rPr>
+        <w:tab/>
+      </w:r>
+      <w:r>
+        <w:rPr>
+          <w:rFonts w:ascii="Times New Roman" w:hAnsi="Times New Roman" w:cs="Times New Roman"/>
+          <w:b/>
+          <w:bCs/>
+          <w:sz w:val="28"/>
+          <w:szCs w:val="28"/>
+        </w:rPr>
+        <w:tab/>
+      </w:r>
+      <w:proofErr w:type="gramStart"/>
+      <w:r>
+        <w:rPr>
+          <w:rFonts w:ascii="Times New Roman" w:hAnsi="Times New Roman" w:cs="Times New Roman"/>
+          <w:b/>
+          <w:bCs/>
+          <w:sz w:val="28"/>
+          <w:szCs w:val="28"/>
+        </w:rPr>
+        <w:tab/>
+      </w:r>
+      <w:r>
+        <w:rPr>
+          <w:rFonts w:ascii="Times New Roman" w:hAnsi="Times New Roman" w:cs="Times New Roman"/>
+          <w:b/>
+          <w:bCs/>
+          <w:sz w:val="28"/>
+          <w:szCs w:val="28"/>
+        </w:rPr>
+        <w:t xml:space="preserve"> :</w:t>
+      </w:r>
+      <w:proofErr w:type="gramEnd"/>
+      <w:r>
+        <w:rPr>
+          <w:rFonts w:ascii="Times New Roman" w:hAnsi="Times New Roman" w:cs="Times New Roman"/>
+          <w:b/>
+          <w:bCs/>
+          <w:sz w:val="28"/>
+          <w:szCs w:val="28"/>
+        </w:rPr>
+        <w:t xml:space="preserve"> B</w:t>
+      </w:r>
+    </w:p>
+    <w:p>
+      <w:pPr>
+        <w:spacing w:line="360" w:lineRule="auto"/>
+        <w:ind w:left="720" w:hanging="720"/>
+        <w:rPr>
+          <w:rFonts w:ascii="Times New Roman" w:hAnsi="Times New Roman" w:cs="Times New Roman"/>
+          <w:b/>
+          <w:bCs/>
+          <w:sz w:val="28"/>
+          <w:szCs w:val="28"/>
+        </w:rPr>
+      </w:pPr>
+      <w:r>
+        <w:rPr>
+          <w:rFonts w:ascii="Times New Roman" w:hAnsi="Times New Roman" w:cs="Times New Roman"/>
+          <w:b/>
+          <w:bCs/>
+          <w:sz w:val="28"/>
+          <w:szCs w:val="28"/>
+        </w:rPr>
+        <w:t xml:space="preserve">Tema </w:t>
+      </w:r>
+      <w:proofErr w:type="spellStart"/>
+      <w:r>
+        <w:rPr>
+          <w:rFonts w:ascii="Times New Roman" w:hAnsi="Times New Roman" w:cs="Times New Roman"/>
+          <w:b/>
+          <w:bCs/>
+          <w:sz w:val="28"/>
+          <w:szCs w:val="28"/>
+        </w:rPr>
+        <w:t>proyek</w:t>
+      </w:r>
+      <w:proofErr w:type="spellEnd"/>
+      <w:r>
+        <w:rPr>
+          <w:rFonts w:ascii="Times New Roman" w:hAnsi="Times New Roman" w:cs="Times New Roman"/>
+          <w:b/>
+          <w:bCs/>
+          <w:sz w:val="28"/>
+          <w:szCs w:val="28"/>
+        </w:rPr>
+        <w:tab/>
+      </w:r>
+      <w:r>
+        <w:rPr>
+          <w:rFonts w:ascii="Times New Roman" w:hAnsi="Times New Roman" w:cs="Times New Roman"/>
+          <w:b/>
+          <w:bCs/>
+          <w:sz w:val="28"/>
+          <w:szCs w:val="28"/>
+        </w:rPr>
+        <w:t xml:space="preserve">: </w:t>
+      </w:r>
+      <w:proofErr w:type="spellStart"/>
+      <w:r>
+        <w:rPr>
+          <w:rFonts w:ascii="Times New Roman" w:hAnsi="Times New Roman" w:cs="Times New Roman"/>
+          <w:b/>
+          <w:bCs/>
+          <w:sz w:val="28"/>
+          <w:szCs w:val="28"/>
+        </w:rPr>
+        <w:t>Perpustakaan</w:t>
+      </w:r>
+      <w:proofErr w:type="spellEnd"/>
+      <w:r>
+        <w:rPr>
+          <w:rFonts w:ascii="Times New Roman" w:hAnsi="Times New Roman" w:cs="Times New Roman"/>
+          <w:b/>
+          <w:bCs/>
+          <w:sz w:val="28"/>
+          <w:szCs w:val="28"/>
+        </w:rPr>
         <w:t xml:space="preserve"> (perpus_120)</w:t>
+      </w:r>
+    </w:p>
+    <w:p>
+      <w:pPr>
+        <w:spacing w:line="360" w:lineRule="auto"/>
+        <w:ind w:left="720" w:hanging="720"/>
+        <w:rPr>
+          <w:rFonts w:ascii="Times New Roman" w:hAnsi="Times New Roman" w:cs="Times New Roman"/>
+          <w:b/>
+          <w:bCs/>
+          <w:sz w:val="28"/>
+          <w:szCs w:val="28"/>
+        </w:rPr>
+      </w:pPr>
+      <w:r>
+        <w:rPr>
+          <w:rFonts w:ascii="Times New Roman" w:hAnsi="Times New Roman" w:cs="Times New Roman"/>
+          <w:b/>
+          <w:bCs/>
+          <w:sz w:val="28"/>
+          <w:szCs w:val="28"/>
+        </w:rPr>
+        <w:t xml:space="preserve">Dosen </w:t>
+      </w:r>
+      <w:proofErr w:type="spellStart"/>
+      <w:r>
+        <w:rPr>
+          <w:rFonts w:ascii="Times New Roman" w:hAnsi="Times New Roman" w:cs="Times New Roman"/>
+          <w:b/>
+          <w:bCs/>
+          <w:sz w:val="28"/>
+          <w:szCs w:val="28"/>
+        </w:rPr>
+        <w:t>Pengampu</w:t>
+      </w:r>
+      <w:proofErr w:type="spellEnd"/>
+      <w:r>
+        <w:rPr>
+          <w:rFonts w:ascii="Times New Roman" w:hAnsi="Times New Roman" w:cs="Times New Roman"/>
+          <w:b/>
+          <w:bCs/>
+          <w:sz w:val="28"/>
+          <w:szCs w:val="28"/>
+        </w:rPr>
+        <w:tab/>
+        <w:t xml:space="preserve">: Dedi Irawan, </w:t>
+      </w:r>
+      <w:proofErr w:type="spellStart"/>
+      <w:proofErr w:type="gramStart"/>
+      <w:r>
+        <w:rPr>
+          <w:rFonts w:ascii="Times New Roman" w:hAnsi="Times New Roman" w:cs="Times New Roman"/>
+          <w:b/>
+          <w:bCs/>
+          <w:sz w:val="28"/>
+          <w:szCs w:val="28"/>
+        </w:rPr>
+        <w:t>S.Kom</w:t>
+      </w:r>
+      <w:proofErr w:type="spellEnd"/>
+      <w:proofErr w:type="gramEnd"/>
+      <w:r>
+        <w:rPr>
+          <w:rFonts w:ascii="Times New Roman" w:hAnsi="Times New Roman" w:cs="Times New Roman"/>
+          <w:b/>
+          <w:bCs/>
+          <w:sz w:val="28"/>
+          <w:szCs w:val="28"/>
+        </w:rPr>
+        <w:t>., M.T.I.</w:t>
       </w:r>
     </w:p>
     <w:p>
@@ -1337,6 +1523,7 @@
           <w:sz w:val="24"/>
           <w:szCs w:val="24"/>
         </w:rPr>
+        <w:lastRenderedPageBreak/>
         <w:t>isi</w:t>
       </w:r>
       <w:proofErr w:type="spellEnd"/>
@@ -1421,7 +1608,6 @@
           <w:sz w:val="24"/>
           <w:szCs w:val="24"/>
         </w:rPr>
-        <w:lastRenderedPageBreak/>
         <w:t xml:space="preserve">3. Langkah yang </w:t>
       </w:r>
       <w:proofErr w:type="spellStart"/>
@@ -2404,6 +2590,7 @@
           <w:sz w:val="24"/>
           <w:szCs w:val="24"/>
         </w:rPr>
+        <w:lastRenderedPageBreak/>
         <w:t xml:space="preserve">3.3 </w:t>
       </w:r>
       <w:proofErr w:type="spellStart"/>
@@ -2469,7 +2656,6 @@
           <w:sz w:val="24"/>
           <w:szCs w:val="24"/>
         </w:rPr>
-        <w:lastRenderedPageBreak/>
         <w:t xml:space="preserve">Password </w:t>
       </w:r>
       <w:proofErr w:type="spellStart"/>
@@ -3286,7 +3472,6 @@
         </w:rPr>
       </w:pPr>
       <w:r>
-        <w:lastRenderedPageBreak/>
         <w:drawing>
           <wp:anchor distT="0" distB="0" distL="114300" distR="114300" simplePos="0" relativeHeight="251662336" behindDoc="0" locked="0" layoutInCell="1" allowOverlap="1" wp14:anchorId="0C5A8F3C" wp14:editId="5327A31A">
             <wp:simplePos x="0" y="0"/>
@@ -3760,6 +3945,7 @@
           <w:sz w:val="24"/>
           <w:szCs w:val="24"/>
         </w:rPr>
+        <w:lastRenderedPageBreak/>
         <w:t xml:space="preserve">3.6 </w:t>
       </w:r>
       <w:proofErr w:type="spellStart"/>
@@ -3825,7 +4011,6 @@
           <w:sz w:val="24"/>
           <w:szCs w:val="24"/>
         </w:rPr>
-        <w:lastRenderedPageBreak/>
         <w:drawing>
           <wp:anchor distT="0" distB="0" distL="114300" distR="114300" simplePos="0" relativeHeight="251665408" behindDoc="0" locked="0" layoutInCell="1" allowOverlap="1" wp14:anchorId="6A0103CC" wp14:editId="4A274B21">
             <wp:simplePos x="0" y="0"/>

</xml_diff>